<commit_message>
Clean up DSA.docx by removing excess whitespace
</commit_message>
<xml_diff>
--- a/DSA.docx
+++ b/DSA.docx
@@ -7,6 +7,9 @@
         <w:jc w:val="center"/>
       </w:pPr>
       <w:r>
+        <w:rPr>
+          <w:noProof/>
+        </w:rPr>
         <w:drawing>
           <wp:inline distT="0" distB="0" distL="0" distR="0" wp14:anchorId="4C97F47C" wp14:editId="21A05E1F">
             <wp:extent cx="6018579" cy="1953260"/>
@@ -49,6 +52,9 @@
         <w:jc w:val="center"/>
       </w:pPr>
       <w:r>
+        <w:rPr>
+          <w:noProof/>
+        </w:rPr>
         <w:drawing>
           <wp:inline distT="0" distB="0" distL="0" distR="0" wp14:anchorId="2F19B702" wp14:editId="13055882">
             <wp:extent cx="6116782" cy="2064348"/>
@@ -91,6 +97,9 @@
         <w:jc w:val="center"/>
       </w:pPr>
       <w:r>
+        <w:rPr>
+          <w:noProof/>
+        </w:rPr>
         <w:drawing>
           <wp:inline distT="0" distB="0" distL="0" distR="0" wp14:anchorId="6D75C639" wp14:editId="1D51D8C1">
             <wp:extent cx="6151418" cy="2058035"/>
@@ -128,6 +137,9 @@
         </w:drawing>
       </w:r>
       <w:r>
+        <w:rPr>
+          <w:noProof/>
+        </w:rPr>
         <w:drawing>
           <wp:inline distT="0" distB="0" distL="0" distR="0" wp14:anchorId="5F0833E0" wp14:editId="7A92AB62">
             <wp:extent cx="6156463" cy="1849582"/>
@@ -169,6 +181,508 @@
       <w:pPr>
         <w:jc w:val="center"/>
       </w:pPr>
+      <w:r>
+        <w:lastRenderedPageBreak/>
+        <w:drawing>
+          <wp:inline distT="0" distB="0" distL="0" distR="0" wp14:anchorId="4AC63317" wp14:editId="484CE52F">
+            <wp:extent cx="6269181" cy="2047240"/>
+            <wp:effectExtent l="0" t="0" r="0" b="0"/>
+            <wp:docPr id="1389039479" name="Picture 1"/>
+            <wp:cNvGraphicFramePr>
+              <a:graphicFrameLocks xmlns:a="http://schemas.openxmlformats.org/drawingml/2006/main" noChangeAspect="1"/>
+            </wp:cNvGraphicFramePr>
+            <a:graphic xmlns:a="http://schemas.openxmlformats.org/drawingml/2006/main">
+              <a:graphicData uri="http://schemas.openxmlformats.org/drawingml/2006/picture">
+                <pic:pic xmlns:pic="http://schemas.openxmlformats.org/drawingml/2006/picture">
+                  <pic:nvPicPr>
+                    <pic:cNvPr id="1389039479" name=""/>
+                    <pic:cNvPicPr/>
+                  </pic:nvPicPr>
+                  <pic:blipFill>
+                    <a:blip r:embed="rId8"/>
+                    <a:stretch>
+                      <a:fillRect/>
+                    </a:stretch>
+                  </pic:blipFill>
+                  <pic:spPr>
+                    <a:xfrm>
+                      <a:off x="0" y="0"/>
+                      <a:ext cx="6305273" cy="2059026"/>
+                    </a:xfrm>
+                    <a:prstGeom prst="rect">
+                      <a:avLst/>
+                    </a:prstGeom>
+                  </pic:spPr>
+                </pic:pic>
+              </a:graphicData>
+            </a:graphic>
+          </wp:inline>
+        </w:drawing>
+      </w:r>
+    </w:p>
+    <w:p>
+      <w:pPr>
+        <w:jc w:val="center"/>
+      </w:pPr>
+      <w:r>
+        <w:drawing>
+          <wp:inline distT="0" distB="0" distL="0" distR="0" wp14:anchorId="764FEEBC" wp14:editId="14BA5C10">
+            <wp:extent cx="6303645" cy="2355272"/>
+            <wp:effectExtent l="0" t="0" r="1905" b="6985"/>
+            <wp:docPr id="1462377637" name="Picture 1"/>
+            <wp:cNvGraphicFramePr>
+              <a:graphicFrameLocks xmlns:a="http://schemas.openxmlformats.org/drawingml/2006/main" noChangeAspect="1"/>
+            </wp:cNvGraphicFramePr>
+            <a:graphic xmlns:a="http://schemas.openxmlformats.org/drawingml/2006/main">
+              <a:graphicData uri="http://schemas.openxmlformats.org/drawingml/2006/picture">
+                <pic:pic xmlns:pic="http://schemas.openxmlformats.org/drawingml/2006/picture">
+                  <pic:nvPicPr>
+                    <pic:cNvPr id="1462377637" name=""/>
+                    <pic:cNvPicPr/>
+                  </pic:nvPicPr>
+                  <pic:blipFill>
+                    <a:blip r:embed="rId9"/>
+                    <a:stretch>
+                      <a:fillRect/>
+                    </a:stretch>
+                  </pic:blipFill>
+                  <pic:spPr>
+                    <a:xfrm>
+                      <a:off x="0" y="0"/>
+                      <a:ext cx="6348553" cy="2372051"/>
+                    </a:xfrm>
+                    <a:prstGeom prst="rect">
+                      <a:avLst/>
+                    </a:prstGeom>
+                  </pic:spPr>
+                </pic:pic>
+              </a:graphicData>
+            </a:graphic>
+          </wp:inline>
+        </w:drawing>
+      </w:r>
+    </w:p>
+    <w:p>
+      <w:pPr>
+        <w:jc w:val="center"/>
+      </w:pPr>
+      <w:r>
+        <w:drawing>
+          <wp:inline distT="0" distB="0" distL="0" distR="0" wp14:anchorId="1A6041F0" wp14:editId="6742A0CA">
+            <wp:extent cx="6400800" cy="1520825"/>
+            <wp:effectExtent l="0" t="0" r="0" b="3175"/>
+            <wp:docPr id="17526064" name="Picture 1"/>
+            <wp:cNvGraphicFramePr>
+              <a:graphicFrameLocks xmlns:a="http://schemas.openxmlformats.org/drawingml/2006/main" noChangeAspect="1"/>
+            </wp:cNvGraphicFramePr>
+            <a:graphic xmlns:a="http://schemas.openxmlformats.org/drawingml/2006/main">
+              <a:graphicData uri="http://schemas.openxmlformats.org/drawingml/2006/picture">
+                <pic:pic xmlns:pic="http://schemas.openxmlformats.org/drawingml/2006/picture">
+                  <pic:nvPicPr>
+                    <pic:cNvPr id="17526064" name=""/>
+                    <pic:cNvPicPr/>
+                  </pic:nvPicPr>
+                  <pic:blipFill>
+                    <a:blip r:embed="rId10"/>
+                    <a:stretch>
+                      <a:fillRect/>
+                    </a:stretch>
+                  </pic:blipFill>
+                  <pic:spPr>
+                    <a:xfrm>
+                      <a:off x="0" y="0"/>
+                      <a:ext cx="6431887" cy="1528211"/>
+                    </a:xfrm>
+                    <a:prstGeom prst="rect">
+                      <a:avLst/>
+                    </a:prstGeom>
+                  </pic:spPr>
+                </pic:pic>
+              </a:graphicData>
+            </a:graphic>
+          </wp:inline>
+        </w:drawing>
+      </w:r>
+    </w:p>
+    <w:p>
+      <w:pPr>
+        <w:jc w:val="center"/>
+      </w:pPr>
+      <w:r>
+        <w:drawing>
+          <wp:inline distT="0" distB="0" distL="0" distR="0" wp14:anchorId="36076AFB" wp14:editId="080B1339">
+            <wp:extent cx="6470073" cy="1673058"/>
+            <wp:effectExtent l="0" t="0" r="6985" b="3810"/>
+            <wp:docPr id="716588730" name="Picture 1"/>
+            <wp:cNvGraphicFramePr>
+              <a:graphicFrameLocks xmlns:a="http://schemas.openxmlformats.org/drawingml/2006/main" noChangeAspect="1"/>
+            </wp:cNvGraphicFramePr>
+            <a:graphic xmlns:a="http://schemas.openxmlformats.org/drawingml/2006/main">
+              <a:graphicData uri="http://schemas.openxmlformats.org/drawingml/2006/picture">
+                <pic:pic xmlns:pic="http://schemas.openxmlformats.org/drawingml/2006/picture">
+                  <pic:nvPicPr>
+                    <pic:cNvPr id="716588730" name=""/>
+                    <pic:cNvPicPr/>
+                  </pic:nvPicPr>
+                  <pic:blipFill>
+                    <a:blip r:embed="rId11"/>
+                    <a:stretch>
+                      <a:fillRect/>
+                    </a:stretch>
+                  </pic:blipFill>
+                  <pic:spPr>
+                    <a:xfrm>
+                      <a:off x="0" y="0"/>
+                      <a:ext cx="6585371" cy="1702872"/>
+                    </a:xfrm>
+                    <a:prstGeom prst="rect">
+                      <a:avLst/>
+                    </a:prstGeom>
+                  </pic:spPr>
+                </pic:pic>
+              </a:graphicData>
+            </a:graphic>
+          </wp:inline>
+        </w:drawing>
+      </w:r>
+    </w:p>
+    <w:p>
+      <w:pPr>
+        <w:jc w:val="center"/>
+      </w:pPr>
+      <w:r>
+        <w:lastRenderedPageBreak/>
+        <w:drawing>
+          <wp:inline distT="0" distB="0" distL="0" distR="0" wp14:anchorId="3D26B7C2" wp14:editId="6DC084B2">
+            <wp:extent cx="6068291" cy="1753870"/>
+            <wp:effectExtent l="0" t="0" r="8890" b="0"/>
+            <wp:docPr id="1589795895" name="Picture 1"/>
+            <wp:cNvGraphicFramePr>
+              <a:graphicFrameLocks xmlns:a="http://schemas.openxmlformats.org/drawingml/2006/main" noChangeAspect="1"/>
+            </wp:cNvGraphicFramePr>
+            <a:graphic xmlns:a="http://schemas.openxmlformats.org/drawingml/2006/main">
+              <a:graphicData uri="http://schemas.openxmlformats.org/drawingml/2006/picture">
+                <pic:pic xmlns:pic="http://schemas.openxmlformats.org/drawingml/2006/picture">
+                  <pic:nvPicPr>
+                    <pic:cNvPr id="1589795895" name=""/>
+                    <pic:cNvPicPr/>
+                  </pic:nvPicPr>
+                  <pic:blipFill>
+                    <a:blip r:embed="rId12"/>
+                    <a:stretch>
+                      <a:fillRect/>
+                    </a:stretch>
+                  </pic:blipFill>
+                  <pic:spPr>
+                    <a:xfrm>
+                      <a:off x="0" y="0"/>
+                      <a:ext cx="6122207" cy="1769453"/>
+                    </a:xfrm>
+                    <a:prstGeom prst="rect">
+                      <a:avLst/>
+                    </a:prstGeom>
+                  </pic:spPr>
+                </pic:pic>
+              </a:graphicData>
+            </a:graphic>
+          </wp:inline>
+        </w:drawing>
+      </w:r>
+    </w:p>
+    <w:p>
+      <w:pPr>
+        <w:jc w:val="center"/>
+      </w:pPr>
+      <w:r>
+        <w:drawing>
+          <wp:inline distT="0" distB="0" distL="0" distR="0" wp14:anchorId="1D7B2C37" wp14:editId="738738FB">
+            <wp:extent cx="6040582" cy="1861723"/>
+            <wp:effectExtent l="0" t="0" r="0" b="5715"/>
+            <wp:docPr id="142604774" name="Picture 1"/>
+            <wp:cNvGraphicFramePr>
+              <a:graphicFrameLocks xmlns:a="http://schemas.openxmlformats.org/drawingml/2006/main" noChangeAspect="1"/>
+            </wp:cNvGraphicFramePr>
+            <a:graphic xmlns:a="http://schemas.openxmlformats.org/drawingml/2006/main">
+              <a:graphicData uri="http://schemas.openxmlformats.org/drawingml/2006/picture">
+                <pic:pic xmlns:pic="http://schemas.openxmlformats.org/drawingml/2006/picture">
+                  <pic:nvPicPr>
+                    <pic:cNvPr id="142604774" name=""/>
+                    <pic:cNvPicPr/>
+                  </pic:nvPicPr>
+                  <pic:blipFill>
+                    <a:blip r:embed="rId13"/>
+                    <a:stretch>
+                      <a:fillRect/>
+                    </a:stretch>
+                  </pic:blipFill>
+                  <pic:spPr>
+                    <a:xfrm>
+                      <a:off x="0" y="0"/>
+                      <a:ext cx="6086445" cy="1875858"/>
+                    </a:xfrm>
+                    <a:prstGeom prst="rect">
+                      <a:avLst/>
+                    </a:prstGeom>
+                  </pic:spPr>
+                </pic:pic>
+              </a:graphicData>
+            </a:graphic>
+          </wp:inline>
+        </w:drawing>
+      </w:r>
+    </w:p>
+    <w:p>
+      <w:pPr>
+        <w:jc w:val="center"/>
+      </w:pPr>
+      <w:r>
+        <w:drawing>
+          <wp:inline distT="0" distB="0" distL="0" distR="0" wp14:anchorId="3AD9CD32" wp14:editId="6C649AAC">
+            <wp:extent cx="6075218" cy="2306114"/>
+            <wp:effectExtent l="0" t="0" r="1905" b="0"/>
+            <wp:docPr id="63132697" name="Picture 1"/>
+            <wp:cNvGraphicFramePr>
+              <a:graphicFrameLocks xmlns:a="http://schemas.openxmlformats.org/drawingml/2006/main" noChangeAspect="1"/>
+            </wp:cNvGraphicFramePr>
+            <a:graphic xmlns:a="http://schemas.openxmlformats.org/drawingml/2006/main">
+              <a:graphicData uri="http://schemas.openxmlformats.org/drawingml/2006/picture">
+                <pic:pic xmlns:pic="http://schemas.openxmlformats.org/drawingml/2006/picture">
+                  <pic:nvPicPr>
+                    <pic:cNvPr id="63132697" name=""/>
+                    <pic:cNvPicPr/>
+                  </pic:nvPicPr>
+                  <pic:blipFill>
+                    <a:blip r:embed="rId14"/>
+                    <a:stretch>
+                      <a:fillRect/>
+                    </a:stretch>
+                  </pic:blipFill>
+                  <pic:spPr>
+                    <a:xfrm>
+                      <a:off x="0" y="0"/>
+                      <a:ext cx="6152726" cy="2335535"/>
+                    </a:xfrm>
+                    <a:prstGeom prst="rect">
+                      <a:avLst/>
+                    </a:prstGeom>
+                  </pic:spPr>
+                </pic:pic>
+              </a:graphicData>
+            </a:graphic>
+          </wp:inline>
+        </w:drawing>
+      </w:r>
+    </w:p>
+    <w:p>
+      <w:pPr>
+        <w:jc w:val="center"/>
+      </w:pPr>
+      <w:r>
+        <w:drawing>
+          <wp:inline distT="0" distB="0" distL="0" distR="0" wp14:anchorId="642022BD" wp14:editId="53F415A0">
+            <wp:extent cx="6102927" cy="1870075"/>
+            <wp:effectExtent l="0" t="0" r="0" b="0"/>
+            <wp:docPr id="276389988" name="Picture 1"/>
+            <wp:cNvGraphicFramePr>
+              <a:graphicFrameLocks xmlns:a="http://schemas.openxmlformats.org/drawingml/2006/main" noChangeAspect="1"/>
+            </wp:cNvGraphicFramePr>
+            <a:graphic xmlns:a="http://schemas.openxmlformats.org/drawingml/2006/main">
+              <a:graphicData uri="http://schemas.openxmlformats.org/drawingml/2006/picture">
+                <pic:pic xmlns:pic="http://schemas.openxmlformats.org/drawingml/2006/picture">
+                  <pic:nvPicPr>
+                    <pic:cNvPr id="276389988" name=""/>
+                    <pic:cNvPicPr/>
+                  </pic:nvPicPr>
+                  <pic:blipFill>
+                    <a:blip r:embed="rId15"/>
+                    <a:stretch>
+                      <a:fillRect/>
+                    </a:stretch>
+                  </pic:blipFill>
+                  <pic:spPr>
+                    <a:xfrm>
+                      <a:off x="0" y="0"/>
+                      <a:ext cx="6179390" cy="1893505"/>
+                    </a:xfrm>
+                    <a:prstGeom prst="rect">
+                      <a:avLst/>
+                    </a:prstGeom>
+                  </pic:spPr>
+                </pic:pic>
+              </a:graphicData>
+            </a:graphic>
+          </wp:inline>
+        </w:drawing>
+      </w:r>
+    </w:p>
+    <w:p>
+      <w:pPr>
+        <w:jc w:val="center"/>
+      </w:pPr>
+      <w:r>
+        <w:lastRenderedPageBreak/>
+        <w:drawing>
+          <wp:inline distT="0" distB="0" distL="0" distR="0" wp14:anchorId="574B8757" wp14:editId="2D2332DF">
+            <wp:extent cx="6309360" cy="2009140"/>
+            <wp:effectExtent l="0" t="0" r="0" b="0"/>
+            <wp:docPr id="969805014" name="Picture 1"/>
+            <wp:cNvGraphicFramePr>
+              <a:graphicFrameLocks xmlns:a="http://schemas.openxmlformats.org/drawingml/2006/main" noChangeAspect="1"/>
+            </wp:cNvGraphicFramePr>
+            <a:graphic xmlns:a="http://schemas.openxmlformats.org/drawingml/2006/main">
+              <a:graphicData uri="http://schemas.openxmlformats.org/drawingml/2006/picture">
+                <pic:pic xmlns:pic="http://schemas.openxmlformats.org/drawingml/2006/picture">
+                  <pic:nvPicPr>
+                    <pic:cNvPr id="969805014" name=""/>
+                    <pic:cNvPicPr/>
+                  </pic:nvPicPr>
+                  <pic:blipFill>
+                    <a:blip r:embed="rId16"/>
+                    <a:stretch>
+                      <a:fillRect/>
+                    </a:stretch>
+                  </pic:blipFill>
+                  <pic:spPr>
+                    <a:xfrm>
+                      <a:off x="0" y="0"/>
+                      <a:ext cx="6324701" cy="2014025"/>
+                    </a:xfrm>
+                    <a:prstGeom prst="rect">
+                      <a:avLst/>
+                    </a:prstGeom>
+                  </pic:spPr>
+                </pic:pic>
+              </a:graphicData>
+            </a:graphic>
+          </wp:inline>
+        </w:drawing>
+      </w:r>
+    </w:p>
+    <w:p>
+      <w:pPr>
+        <w:jc w:val="center"/>
+      </w:pPr>
+      <w:r>
+        <w:drawing>
+          <wp:inline distT="0" distB="0" distL="0" distR="0" wp14:anchorId="1DF95F8F" wp14:editId="65942A93">
+            <wp:extent cx="6286500" cy="2115820"/>
+            <wp:effectExtent l="0" t="0" r="0" b="0"/>
+            <wp:docPr id="1676853663" name="Picture 1"/>
+            <wp:cNvGraphicFramePr>
+              <a:graphicFrameLocks xmlns:a="http://schemas.openxmlformats.org/drawingml/2006/main" noChangeAspect="1"/>
+            </wp:cNvGraphicFramePr>
+            <a:graphic xmlns:a="http://schemas.openxmlformats.org/drawingml/2006/main">
+              <a:graphicData uri="http://schemas.openxmlformats.org/drawingml/2006/picture">
+                <pic:pic xmlns:pic="http://schemas.openxmlformats.org/drawingml/2006/picture">
+                  <pic:nvPicPr>
+                    <pic:cNvPr id="1676853663" name=""/>
+                    <pic:cNvPicPr/>
+                  </pic:nvPicPr>
+                  <pic:blipFill>
+                    <a:blip r:embed="rId17"/>
+                    <a:stretch>
+                      <a:fillRect/>
+                    </a:stretch>
+                  </pic:blipFill>
+                  <pic:spPr>
+                    <a:xfrm>
+                      <a:off x="0" y="0"/>
+                      <a:ext cx="6302544" cy="2121220"/>
+                    </a:xfrm>
+                    <a:prstGeom prst="rect">
+                      <a:avLst/>
+                    </a:prstGeom>
+                  </pic:spPr>
+                </pic:pic>
+              </a:graphicData>
+            </a:graphic>
+          </wp:inline>
+        </w:drawing>
+      </w:r>
+    </w:p>
+    <w:p>
+      <w:pPr>
+        <w:jc w:val="center"/>
+      </w:pPr>
+      <w:r>
+        <w:drawing>
+          <wp:inline distT="0" distB="0" distL="0" distR="0" wp14:anchorId="265C497F" wp14:editId="76E170FB">
+            <wp:extent cx="6286500" cy="1834515"/>
+            <wp:effectExtent l="0" t="0" r="0" b="0"/>
+            <wp:docPr id="1320652531" name="Picture 1"/>
+            <wp:cNvGraphicFramePr>
+              <a:graphicFrameLocks xmlns:a="http://schemas.openxmlformats.org/drawingml/2006/main" noChangeAspect="1"/>
+            </wp:cNvGraphicFramePr>
+            <a:graphic xmlns:a="http://schemas.openxmlformats.org/drawingml/2006/main">
+              <a:graphicData uri="http://schemas.openxmlformats.org/drawingml/2006/picture">
+                <pic:pic xmlns:pic="http://schemas.openxmlformats.org/drawingml/2006/picture">
+                  <pic:nvPicPr>
+                    <pic:cNvPr id="1320652531" name=""/>
+                    <pic:cNvPicPr/>
+                  </pic:nvPicPr>
+                  <pic:blipFill>
+                    <a:blip r:embed="rId18"/>
+                    <a:stretch>
+                      <a:fillRect/>
+                    </a:stretch>
+                  </pic:blipFill>
+                  <pic:spPr>
+                    <a:xfrm>
+                      <a:off x="0" y="0"/>
+                      <a:ext cx="6306353" cy="1840308"/>
+                    </a:xfrm>
+                    <a:prstGeom prst="rect">
+                      <a:avLst/>
+                    </a:prstGeom>
+                  </pic:spPr>
+                </pic:pic>
+              </a:graphicData>
+            </a:graphic>
+          </wp:inline>
+        </w:drawing>
+      </w:r>
+    </w:p>
+    <w:p>
+      <w:pPr>
+        <w:jc w:val="center"/>
+      </w:pPr>
+      <w:r>
+        <w:drawing>
+          <wp:inline distT="0" distB="0" distL="0" distR="0" wp14:anchorId="0C97AC01" wp14:editId="0E86B360">
+            <wp:extent cx="6355080" cy="1851660"/>
+            <wp:effectExtent l="0" t="0" r="7620" b="0"/>
+            <wp:docPr id="607456525" name="Picture 1"/>
+            <wp:cNvGraphicFramePr>
+              <a:graphicFrameLocks xmlns:a="http://schemas.openxmlformats.org/drawingml/2006/main" noChangeAspect="1"/>
+            </wp:cNvGraphicFramePr>
+            <a:graphic xmlns:a="http://schemas.openxmlformats.org/drawingml/2006/main">
+              <a:graphicData uri="http://schemas.openxmlformats.org/drawingml/2006/picture">
+                <pic:pic xmlns:pic="http://schemas.openxmlformats.org/drawingml/2006/picture">
+                  <pic:nvPicPr>
+                    <pic:cNvPr id="607456525" name=""/>
+                    <pic:cNvPicPr/>
+                  </pic:nvPicPr>
+                  <pic:blipFill>
+                    <a:blip r:embed="rId19"/>
+                    <a:stretch>
+                      <a:fillRect/>
+                    </a:stretch>
+                  </pic:blipFill>
+                  <pic:spPr>
+                    <a:xfrm>
+                      <a:off x="0" y="0"/>
+                      <a:ext cx="6368204" cy="1855484"/>
+                    </a:xfrm>
+                    <a:prstGeom prst="rect">
+                      <a:avLst/>
+                    </a:prstGeom>
+                  </pic:spPr>
+                </pic:pic>
+              </a:graphicData>
+            </a:graphic>
+          </wp:inline>
+        </w:drawing>
+      </w:r>
     </w:p>
     <w:sectPr>
       <w:pgSz w:w="12240" w:h="15840"/>

</xml_diff>

<commit_message>
Add initial version of HTML document for Lenovo project
</commit_message>
<xml_diff>
--- a/DSA.docx
+++ b/DSA.docx
@@ -182,6 +182,9 @@
         <w:jc w:val="center"/>
       </w:pPr>
       <w:r>
+        <w:rPr>
+          <w:noProof/>
+        </w:rPr>
         <w:lastRenderedPageBreak/>
         <w:drawing>
           <wp:inline distT="0" distB="0" distL="0" distR="0" wp14:anchorId="4AC63317" wp14:editId="484CE52F">
@@ -225,6 +228,9 @@
         <w:jc w:val="center"/>
       </w:pPr>
       <w:r>
+        <w:rPr>
+          <w:noProof/>
+        </w:rPr>
         <w:drawing>
           <wp:inline distT="0" distB="0" distL="0" distR="0" wp14:anchorId="764FEEBC" wp14:editId="14BA5C10">
             <wp:extent cx="6303645" cy="2355272"/>
@@ -267,6 +273,9 @@
         <w:jc w:val="center"/>
       </w:pPr>
       <w:r>
+        <w:rPr>
+          <w:noProof/>
+        </w:rPr>
         <w:drawing>
           <wp:inline distT="0" distB="0" distL="0" distR="0" wp14:anchorId="1A6041F0" wp14:editId="6742A0CA">
             <wp:extent cx="6400800" cy="1520825"/>
@@ -309,6 +318,9 @@
         <w:jc w:val="center"/>
       </w:pPr>
       <w:r>
+        <w:rPr>
+          <w:noProof/>
+        </w:rPr>
         <w:drawing>
           <wp:inline distT="0" distB="0" distL="0" distR="0" wp14:anchorId="36076AFB" wp14:editId="080B1339">
             <wp:extent cx="6470073" cy="1673058"/>
@@ -351,6 +363,9 @@
         <w:jc w:val="center"/>
       </w:pPr>
       <w:r>
+        <w:rPr>
+          <w:noProof/>
+        </w:rPr>
         <w:lastRenderedPageBreak/>
         <w:drawing>
           <wp:inline distT="0" distB="0" distL="0" distR="0" wp14:anchorId="3D26B7C2" wp14:editId="6DC084B2">
@@ -394,6 +409,9 @@
         <w:jc w:val="center"/>
       </w:pPr>
       <w:r>
+        <w:rPr>
+          <w:noProof/>
+        </w:rPr>
         <w:drawing>
           <wp:inline distT="0" distB="0" distL="0" distR="0" wp14:anchorId="1D7B2C37" wp14:editId="738738FB">
             <wp:extent cx="6040582" cy="1861723"/>
@@ -436,6 +454,9 @@
         <w:jc w:val="center"/>
       </w:pPr>
       <w:r>
+        <w:rPr>
+          <w:noProof/>
+        </w:rPr>
         <w:drawing>
           <wp:inline distT="0" distB="0" distL="0" distR="0" wp14:anchorId="3AD9CD32" wp14:editId="6C649AAC">
             <wp:extent cx="6075218" cy="2306114"/>
@@ -478,6 +499,9 @@
         <w:jc w:val="center"/>
       </w:pPr>
       <w:r>
+        <w:rPr>
+          <w:noProof/>
+        </w:rPr>
         <w:drawing>
           <wp:inline distT="0" distB="0" distL="0" distR="0" wp14:anchorId="642022BD" wp14:editId="53F415A0">
             <wp:extent cx="6102927" cy="1870075"/>
@@ -520,6 +544,9 @@
         <w:jc w:val="center"/>
       </w:pPr>
       <w:r>
+        <w:rPr>
+          <w:noProof/>
+        </w:rPr>
         <w:lastRenderedPageBreak/>
         <w:drawing>
           <wp:inline distT="0" distB="0" distL="0" distR="0" wp14:anchorId="574B8757" wp14:editId="2D2332DF">
@@ -563,6 +590,9 @@
         <w:jc w:val="center"/>
       </w:pPr>
       <w:r>
+        <w:rPr>
+          <w:noProof/>
+        </w:rPr>
         <w:drawing>
           <wp:inline distT="0" distB="0" distL="0" distR="0" wp14:anchorId="1DF95F8F" wp14:editId="65942A93">
             <wp:extent cx="6286500" cy="2115820"/>
@@ -605,6 +635,9 @@
         <w:jc w:val="center"/>
       </w:pPr>
       <w:r>
+        <w:rPr>
+          <w:noProof/>
+        </w:rPr>
         <w:drawing>
           <wp:inline distT="0" distB="0" distL="0" distR="0" wp14:anchorId="265C497F" wp14:editId="76E170FB">
             <wp:extent cx="6286500" cy="1834515"/>
@@ -647,6 +680,9 @@
         <w:jc w:val="center"/>
       </w:pPr>
       <w:r>
+        <w:rPr>
+          <w:noProof/>
+        </w:rPr>
         <w:drawing>
           <wp:inline distT="0" distB="0" distL="0" distR="0" wp14:anchorId="0C97AC01" wp14:editId="0E86B360">
             <wp:extent cx="6355080" cy="1851660"/>
@@ -672,6 +708,153 @@
                     <a:xfrm>
                       <a:off x="0" y="0"/>
                       <a:ext cx="6368204" cy="1855484"/>
+                    </a:xfrm>
+                    <a:prstGeom prst="rect">
+                      <a:avLst/>
+                    </a:prstGeom>
+                  </pic:spPr>
+                </pic:pic>
+              </a:graphicData>
+            </a:graphic>
+          </wp:inline>
+        </w:drawing>
+      </w:r>
+    </w:p>
+    <w:p>
+      <w:pPr>
+        <w:jc w:val="center"/>
+        <w:rPr>
+          <w:b/>
+          <w:bCs/>
+        </w:rPr>
+      </w:pPr>
+      <w:r>
+        <w:lastRenderedPageBreak/>
+        <w:drawing>
+          <wp:inline distT="0" distB="0" distL="0" distR="0" wp14:anchorId="4FDB3CCD" wp14:editId="14BB9C84">
+            <wp:extent cx="6113145" cy="1580931"/>
+            <wp:effectExtent l="0" t="0" r="1905" b="635"/>
+            <wp:docPr id="1396760500" name="Picture 1"/>
+            <wp:cNvGraphicFramePr>
+              <a:graphicFrameLocks xmlns:a="http://schemas.openxmlformats.org/drawingml/2006/main" noChangeAspect="1"/>
+            </wp:cNvGraphicFramePr>
+            <a:graphic xmlns:a="http://schemas.openxmlformats.org/drawingml/2006/main">
+              <a:graphicData uri="http://schemas.openxmlformats.org/drawingml/2006/picture">
+                <pic:pic xmlns:pic="http://schemas.openxmlformats.org/drawingml/2006/picture">
+                  <pic:nvPicPr>
+                    <pic:cNvPr id="1396760500" name=""/>
+                    <pic:cNvPicPr/>
+                  </pic:nvPicPr>
+                  <pic:blipFill>
+                    <a:blip r:embed="rId20"/>
+                    <a:stretch>
+                      <a:fillRect/>
+                    </a:stretch>
+                  </pic:blipFill>
+                  <pic:spPr>
+                    <a:xfrm>
+                      <a:off x="0" y="0"/>
+                      <a:ext cx="6200627" cy="1603555"/>
+                    </a:xfrm>
+                    <a:prstGeom prst="rect">
+                      <a:avLst/>
+                    </a:prstGeom>
+                  </pic:spPr>
+                </pic:pic>
+              </a:graphicData>
+            </a:graphic>
+          </wp:inline>
+        </w:drawing>
+      </w:r>
+    </w:p>
+    <w:p>
+      <w:pPr>
+        <w:jc w:val="center"/>
+        <w:rPr>
+          <w:b/>
+          <w:bCs/>
+        </w:rPr>
+      </w:pPr>
+      <w:r>
+        <w:rPr>
+          <w:b/>
+          <w:bCs/>
+        </w:rPr>
+        <w:drawing>
+          <wp:inline distT="0" distB="0" distL="0" distR="0" wp14:anchorId="5068F2B9" wp14:editId="48B02C5A">
+            <wp:extent cx="6271846" cy="2089785"/>
+            <wp:effectExtent l="0" t="0" r="0" b="5715"/>
+            <wp:docPr id="1736539879" name="Picture 1"/>
+            <wp:cNvGraphicFramePr>
+              <a:graphicFrameLocks xmlns:a="http://schemas.openxmlformats.org/drawingml/2006/main" noChangeAspect="1"/>
+            </wp:cNvGraphicFramePr>
+            <a:graphic xmlns:a="http://schemas.openxmlformats.org/drawingml/2006/main">
+              <a:graphicData uri="http://schemas.openxmlformats.org/drawingml/2006/picture">
+                <pic:pic xmlns:pic="http://schemas.openxmlformats.org/drawingml/2006/picture">
+                  <pic:nvPicPr>
+                    <pic:cNvPr id="1736539879" name=""/>
+                    <pic:cNvPicPr/>
+                  </pic:nvPicPr>
+                  <pic:blipFill>
+                    <a:blip r:embed="rId21"/>
+                    <a:stretch>
+                      <a:fillRect/>
+                    </a:stretch>
+                  </pic:blipFill>
+                  <pic:spPr>
+                    <a:xfrm>
+                      <a:off x="0" y="0"/>
+                      <a:ext cx="6343687" cy="2113722"/>
+                    </a:xfrm>
+                    <a:prstGeom prst="rect">
+                      <a:avLst/>
+                    </a:prstGeom>
+                  </pic:spPr>
+                </pic:pic>
+              </a:graphicData>
+            </a:graphic>
+          </wp:inline>
+        </w:drawing>
+      </w:r>
+    </w:p>
+    <w:p>
+      <w:pPr>
+        <w:jc w:val="center"/>
+        <w:rPr>
+          <w:b/>
+          <w:bCs/>
+        </w:rPr>
+      </w:pPr>
+      <w:r>
+        <w:rPr>
+          <w:b/>
+          <w:bCs/>
+        </w:rPr>
+        <w:drawing>
+          <wp:inline distT="0" distB="0" distL="0" distR="0" wp14:anchorId="6FC20531" wp14:editId="13AC3099">
+            <wp:extent cx="6265985" cy="1656080"/>
+            <wp:effectExtent l="0" t="0" r="1905" b="1270"/>
+            <wp:docPr id="1444629335" name="Picture 1"/>
+            <wp:cNvGraphicFramePr>
+              <a:graphicFrameLocks xmlns:a="http://schemas.openxmlformats.org/drawingml/2006/main" noChangeAspect="1"/>
+            </wp:cNvGraphicFramePr>
+            <a:graphic xmlns:a="http://schemas.openxmlformats.org/drawingml/2006/main">
+              <a:graphicData uri="http://schemas.openxmlformats.org/drawingml/2006/picture">
+                <pic:pic xmlns:pic="http://schemas.openxmlformats.org/drawingml/2006/picture">
+                  <pic:nvPicPr>
+                    <pic:cNvPr id="1444629335" name=""/>
+                    <pic:cNvPicPr/>
+                  </pic:nvPicPr>
+                  <pic:blipFill>
+                    <a:blip r:embed="rId22"/>
+                    <a:stretch>
+                      <a:fillRect/>
+                    </a:stretch>
+                  </pic:blipFill>
+                  <pic:spPr>
+                    <a:xfrm>
+                      <a:off x="0" y="0"/>
+                      <a:ext cx="6293209" cy="1663275"/>
                     </a:xfrm>
                     <a:prstGeom prst="rect">
                       <a:avLst/>

</xml_diff>